<commit_message>
Doc gen working fabulously with every field extracting data
</commit_message>
<xml_diff>
--- a/backend/app/services/doc_engine/templates/en/chargesheet.docx
+++ b/backend/app/services/doc_engine/templates/en/chargesheet.docx
@@ -389,14 +389,14 @@
         <w:tblLook w:val="04A0" w:firstRow="1" w:lastRow="0" w:firstColumn="1" w:lastColumn="0" w:noHBand="0" w:noVBand="1"/>
       </w:tblPr>
       <w:tblGrid>
-        <w:gridCol w:w="945"/>
-        <w:gridCol w:w="1137"/>
-        <w:gridCol w:w="1079"/>
-        <w:gridCol w:w="1003"/>
-        <w:gridCol w:w="1232"/>
-        <w:gridCol w:w="1861"/>
-        <w:gridCol w:w="1776"/>
-        <w:gridCol w:w="1155"/>
+        <w:gridCol w:w="919"/>
+        <w:gridCol w:w="1415"/>
+        <w:gridCol w:w="1047"/>
+        <w:gridCol w:w="974"/>
+        <w:gridCol w:w="1194"/>
+        <w:gridCol w:w="1800"/>
+        <w:gridCol w:w="1718"/>
+        <w:gridCol w:w="1121"/>
       </w:tblGrid>
       <w:tr>
         <w:tc>
@@ -487,26 +487,10 @@
           </w:tcPr>
           <w:p>
             <w:r>
-              <w:t xml:space="preserve">{% for suspect in suspects </w:t>
-            </w:r>
-            <w:proofErr w:type="gramStart"/>
-            <w:r>
-              <w:t>%}</w:t>
+              <w:t>{% for suspect in suspects %}</w:t>
             </w:r>
             <w:r>
-              <w:t xml:space="preserve">{{ </w:t>
-            </w:r>
-            <w:proofErr w:type="spellStart"/>
-            <w:r>
-              <w:t>loop</w:t>
-            </w:r>
-            <w:proofErr w:type="gramEnd"/>
-            <w:r>
-              <w:t>.index</w:t>
-            </w:r>
-            <w:proofErr w:type="spellEnd"/>
-            <w:r>
-              <w:t xml:space="preserve"> }}</w:t>
+              <w:t>{{ loop.index }}</w:t>
             </w:r>
           </w:p>
         </w:tc>
@@ -516,7 +500,13 @@
           </w:tcPr>
           <w:p>
             <w:r>
-              <w:t>{{ suspect.name }}</w:t>
+              <w:t>{{ suspect.</w:t>
+            </w:r>
+            <w:r>
+              <w:t>full_</w:t>
+            </w:r>
+            <w:r>
+              <w:t>name }}</w:t>
             </w:r>
           </w:p>
         </w:tc>
@@ -588,15 +578,7 @@
           </w:tcPr>
           <w:p>
             <w:r>
-              <w:t xml:space="preserve">{% </w:t>
-            </w:r>
-            <w:proofErr w:type="spellStart"/>
-            <w:r>
-              <w:t>endfor</w:t>
-            </w:r>
-            <w:proofErr w:type="spellEnd"/>
-            <w:r>
-              <w:t xml:space="preserve"> %}</w:t>
+              <w:t>{% endfor %}</w:t>
             </w:r>
           </w:p>
         </w:tc>
@@ -725,26 +707,10 @@
           </w:tcPr>
           <w:p>
             <w:r>
-              <w:t xml:space="preserve">{% for victim in victims </w:t>
-            </w:r>
-            <w:proofErr w:type="gramStart"/>
-            <w:r>
-              <w:t>%}</w:t>
+              <w:t>{% for victim in victims %}</w:t>
             </w:r>
             <w:r>
-              <w:t xml:space="preserve">{{ </w:t>
-            </w:r>
-            <w:proofErr w:type="spellStart"/>
-            <w:r>
-              <w:t>loop</w:t>
-            </w:r>
-            <w:proofErr w:type="gramEnd"/>
-            <w:r>
-              <w:t>.index</w:t>
-            </w:r>
-            <w:proofErr w:type="spellEnd"/>
-            <w:r>
-              <w:t xml:space="preserve"> }}</w:t>
+              <w:t>{{ loop.index }}</w:t>
             </w:r>
           </w:p>
         </w:tc>
@@ -754,7 +720,13 @@
           </w:tcPr>
           <w:p>
             <w:r>
-              <w:t>{{ victim.name }}</w:t>
+              <w:t>{{ victim.</w:t>
+            </w:r>
+            <w:r>
+              <w:t>full_</w:t>
+            </w:r>
+            <w:r>
+              <w:t>name }}</w:t>
             </w:r>
           </w:p>
         </w:tc>
@@ -796,15 +768,7 @@
           </w:tcPr>
           <w:p>
             <w:r>
-              <w:t xml:space="preserve">{% </w:t>
-            </w:r>
-            <w:proofErr w:type="spellStart"/>
-            <w:r>
-              <w:t>endfor</w:t>
-            </w:r>
-            <w:proofErr w:type="spellEnd"/>
-            <w:r>
-              <w:t xml:space="preserve"> %}</w:t>
+              <w:t>{% endfor %}</w:t>
             </w:r>
           </w:p>
         </w:tc>
@@ -908,26 +872,10 @@
             </w:r>
             <w:r>
               <w:lastRenderedPageBreak/>
-              <w:t xml:space="preserve">witnesses </w:t>
-            </w:r>
-            <w:proofErr w:type="gramStart"/>
-            <w:r>
-              <w:t>%}</w:t>
+              <w:t>witnesses %}</w:t>
             </w:r>
             <w:r>
-              <w:t xml:space="preserve">{{ </w:t>
-            </w:r>
-            <w:proofErr w:type="spellStart"/>
-            <w:r>
-              <w:t>loop</w:t>
-            </w:r>
-            <w:proofErr w:type="gramEnd"/>
-            <w:r>
-              <w:t>.index</w:t>
-            </w:r>
-            <w:proofErr w:type="spellEnd"/>
-            <w:r>
-              <w:t xml:space="preserve"> }}</w:t>
+              <w:t>{{ loop.index }}</w:t>
             </w:r>
           </w:p>
         </w:tc>
@@ -970,15 +918,7 @@
           </w:tcPr>
           <w:p>
             <w:r>
-              <w:t xml:space="preserve">{% </w:t>
-            </w:r>
-            <w:proofErr w:type="spellStart"/>
-            <w:r>
-              <w:t>endfor</w:t>
-            </w:r>
-            <w:proofErr w:type="spellEnd"/>
-            <w:r>
-              <w:t xml:space="preserve"> %}</w:t>
+              <w:t>{% endfor %}</w:t>
             </w:r>
           </w:p>
         </w:tc>
@@ -1094,26 +1034,10 @@
           </w:tcPr>
           <w:p>
             <w:r>
-              <w:t xml:space="preserve">{% for item in evidence </w:t>
-            </w:r>
-            <w:proofErr w:type="gramStart"/>
-            <w:r>
-              <w:t>%}</w:t>
+              <w:t>{% for item in evidence %}</w:t>
             </w:r>
             <w:r>
-              <w:t xml:space="preserve">{{ </w:t>
-            </w:r>
-            <w:proofErr w:type="spellStart"/>
-            <w:r>
-              <w:t>loop</w:t>
-            </w:r>
-            <w:proofErr w:type="gramEnd"/>
-            <w:r>
-              <w:t>.index</w:t>
-            </w:r>
-            <w:proofErr w:type="spellEnd"/>
-            <w:r>
-              <w:t xml:space="preserve"> }}</w:t>
+              <w:t>{{ loop.index }}</w:t>
             </w:r>
           </w:p>
         </w:tc>
@@ -1175,15 +1099,7 @@
           </w:tcPr>
           <w:p>
             <w:r>
-              <w:t xml:space="preserve">{% </w:t>
-            </w:r>
-            <w:proofErr w:type="spellStart"/>
-            <w:r>
-              <w:t>endfor</w:t>
-            </w:r>
-            <w:proofErr w:type="spellEnd"/>
-            <w:r>
-              <w:t xml:space="preserve"> %}</w:t>
+              <w:t>{% endfor %}</w:t>
             </w:r>
           </w:p>
         </w:tc>
@@ -1278,34 +1194,10 @@
           </w:tcPr>
           <w:p>
             <w:r>
-              <w:t xml:space="preserve">{% for section in </w:t>
-            </w:r>
-            <w:proofErr w:type="spellStart"/>
-            <w:r>
-              <w:t>legal_sections</w:t>
-            </w:r>
-            <w:proofErr w:type="spellEnd"/>
-            <w:r>
-              <w:t xml:space="preserve"> </w:t>
-            </w:r>
-            <w:proofErr w:type="gramStart"/>
-            <w:r>
-              <w:t>%}</w:t>
+              <w:t>{% for section in legal_sections %}</w:t>
             </w:r>
             <w:r>
-              <w:t xml:space="preserve">{{ </w:t>
-            </w:r>
-            <w:proofErr w:type="spellStart"/>
-            <w:r>
-              <w:t>section.act</w:t>
-            </w:r>
-            <w:proofErr w:type="gramEnd"/>
-            <w:r>
-              <w:t>_code</w:t>
-            </w:r>
-            <w:proofErr w:type="spellEnd"/>
-            <w:r>
-              <w:t xml:space="preserve"> }}</w:t>
+              <w:t>{{ section.act_code }}</w:t>
             </w:r>
           </w:p>
         </w:tc>
@@ -1337,15 +1229,7 @@
           </w:tcPr>
           <w:p>
             <w:r>
-              <w:t xml:space="preserve">{% </w:t>
-            </w:r>
-            <w:proofErr w:type="spellStart"/>
-            <w:r>
-              <w:t>endfor</w:t>
-            </w:r>
-            <w:proofErr w:type="spellEnd"/>
-            <w:r>
-              <w:t xml:space="preserve"> %}</w:t>
+              <w:t>{% endfor %}</w:t>
             </w:r>
           </w:p>
         </w:tc>

</xml_diff>